<commit_message>
Standart update and hist homework 3
</commit_message>
<xml_diff>
--- a/informatics/annotations/Аннотация2_коды_исправления_ошибок.docx
+++ b/informatics/annotations/Аннотация2_коды_исправления_ошибок.docx
@@ -451,7 +451,7 @@
               <w:rPr>
                 <w:sz w:val="18"/>
               </w:rPr>
-              <w:t>‘Magical’ Error Correction Scheme Proved Inherently Inefficient (Quanta Magazine)</w:t>
+              <w:t>Language Modeling Is Compression (Delétang G. et al., Google DeepMind; ICLR 2024)</w:t>
             </w:r>
           </w:p>
         </w:tc>
@@ -479,7 +479,7 @@
                 <w:sz w:val="18"/>
                 <w:lang w:val="ru-RU"/>
               </w:rPr>
-              <w:t>09.01.2024</w:t>
+              <w:t>19.09.2023</w:t>
             </w:r>
           </w:p>
         </w:tc>
@@ -507,7 +507,7 @@
                 <w:sz w:val="18"/>
                 <w:szCs w:val="18"/>
               </w:rPr>
-              <w:t>~2200</w:t>
+              <w:t>~6500</w:t>
             </w:r>
           </w:p>
         </w:tc>
@@ -1473,7 +1473,7 @@
               </w:rPr>
             </w:pPr>
             <w:r>
-              <w:t>https://www.quantamagazine.org/magical-error-correction-scheme-proved-inherently-inefficient-20240109/</w:t>
+              <w:t>https://arxiv.org/abs/2309.10668</w:t>
             </w:r>
             <w:proofErr w:type="spellStart"/>
             <w:proofErr w:type="spellEnd"/>
@@ -1520,7 +1520,7 @@
               <w:rPr>
                 <w:lang w:val="ru-RU"/>
               </w:rPr>
-              <w:t>коды, исправляющие ошибки, локально исправляемые коды, коды Рида–Маллера</w:t>
+              <w:t>сжатие без потерь, арифметическое кодирование, языковые модели, коэффициент сжатия, токенизация</w:t>
             </w:r>
             <w:proofErr w:type="spellEnd"/>
             <w:proofErr w:type="spellStart"/>
@@ -1574,7 +1574,7 @@
               <w:rPr>
                 <w:lang w:val="ru-RU"/>
               </w:rPr>
-              <w:t>Код повторения заменяет каждый бит тремя одинаковыми и утраивает длину сообщения.</w:t>
+              <w:t>По теореме Шеннона длина оптимального кода символа равна минус логарифму его вероятности, поэтому точное предсказание даёт сильное сжатие.</w:t>
             </w:r>
             <w:proofErr w:type="spellStart"/>
             <w:proofErr w:type="spellEnd"/>
@@ -1595,7 +1595,7 @@
               <w:rPr>
                 <w:lang w:val="ru-RU"/>
               </w:rPr>
-              <w:t>Коды Рида–Соломона компактны, но для исправления ошибки требуют прочитать всё сообщение.</w:t>
+              <w:t>Предсказания модели превращаются в код арифметическим кодированием, которое почти достигает предела Шеннона.</w:t>
             </w:r>
           </w:p>
           <w:p>
@@ -1614,7 +1614,7 @@
               <w:rPr>
                 <w:lang w:val="ru-RU"/>
               </w:rPr>
-              <w:t>Локально исправляемые коды чинят любой бит, читая лишь несколько позиций данных.</w:t>
+              <w:t>Из-за ограниченного контекста трансформера данные сжимаются кусками по 2048 байт.</w:t>
             </w:r>
           </w:p>
           <w:p>
@@ -1633,7 +1633,7 @@
               <w:rPr>
                 <w:lang w:val="ru-RU"/>
               </w:rPr>
-              <w:t>Коды Рида–Маллера, придуманные в 1954 году, основаны на многочленах от нескольких переменных.</w:t>
+              <w:t>Chinchilla 70B сжала текст enwik9 до 8,3 % объёма, а gzip и LZMA2 на тех же кусках оставили около половины.</w:t>
             </w:r>
           </w:p>
           <w:p>
@@ -1652,7 +1652,76 @@
               <w:rPr>
                 <w:lang w:val="ru-RU"/>
               </w:rPr>
-              <w:t>Котхари и Манохар доказали, что трёхзапросные такие коды не бывают короче кодов Рида–Маллера.</w:t>
+              <w:t>Модель, обученная почти только на тексте, сжала картинки ImageNet и речь LibriSpeech лучше форматов PNG и FLAC.</w:t>
+            </w:r>
+            <w:proofErr w:type="spellStart"/>
+            <w:proofErr w:type="spellEnd"/>
+            <w:proofErr w:type="spellStart"/>
+            <w:proofErr w:type="spellEnd"/>
+          </w:p>
+          <w:p>
+            <w:pPr>
+              <w:pStyle w:val="TableContents"/>
+              <w:numPr>
+                <w:ilvl w:val="0"/>
+                <w:numId w:val="4"/>
+              </w:numPr>
+              <w:ind w:left="381"/>
+              <w:rPr>
+                <w:lang w:val="ru-RU"/>
+              </w:rPr>
+            </w:pPr>
+            <w:r>
+              <w:rPr>
+                <w:lang w:val="ru-RU"/>
+              </w:rPr>
+              <w:t>С учётом размера самой модели большие нейросети на гигабайтных наборах сжимают многократно хуже архиваторов.</w:t>
+            </w:r>
+            <w:proofErr w:type="spellStart"/>
+            <w:proofErr w:type="spellEnd"/>
+            <w:proofErr w:type="spellStart"/>
+            <w:proofErr w:type="spellEnd"/>
+          </w:p>
+          <w:p>
+            <w:pPr>
+              <w:pStyle w:val="TableContents"/>
+              <w:numPr>
+                <w:ilvl w:val="0"/>
+                <w:numId w:val="4"/>
+              </w:numPr>
+              <w:ind w:left="381"/>
+              <w:rPr>
+                <w:lang w:val="ru-RU"/>
+              </w:rPr>
+            </w:pPr>
+            <w:r>
+              <w:rPr>
+                <w:lang w:val="ru-RU"/>
+              </w:rPr>
+              <w:t>Для каждого объёма данных есть оптимальный размер модели, после которого сжатие ухудшается.</w:t>
+            </w:r>
+            <w:proofErr w:type="spellStart"/>
+            <w:proofErr w:type="spellEnd"/>
+            <w:proofErr w:type="spellStart"/>
+            <w:proofErr w:type="spellEnd"/>
+          </w:p>
+          <w:p>
+            <w:pPr>
+              <w:pStyle w:val="TableContents"/>
+              <w:numPr>
+                <w:ilvl w:val="0"/>
+                <w:numId w:val="4"/>
+              </w:numPr>
+              <w:ind w:left="381"/>
+              <w:rPr>
+                <w:lang w:val="ru-RU"/>
+              </w:rPr>
+            </w:pPr>
+            <w:r>
+              <w:rPr>
+                <w:lang w:val="ru-RU"/>
+              </w:rPr>
+              <w:t>Любой архиватор, даже gzip, можно превратить в генератор данных, но его тексты бессвязны.</w:t>
             </w:r>
             <w:proofErr w:type="spellStart"/>
             <w:proofErr w:type="spellEnd"/>
@@ -1708,7 +1777,7 @@
               <w:rPr>
                 <w:lang w:val="ru-RU"/>
               </w:rPr>
-              <w:t>Для исправления ошибки не нужно читать весь массив данных.</w:t>
+              <w:t>Одна универсальная модель сжимает текст, изображения и звук без настройки под формат.</w:t>
             </w:r>
           </w:p>
           <w:p>
@@ -1727,7 +1796,7 @@
               <w:rPr>
                 <w:lang w:val="ru-RU"/>
               </w:rPr>
-              <w:t>Код устойчив к намеренной порче данных злоумышленником.</w:t>
+              <w:t>Взгляд через сжатие даёт измеримый критерий качества модели в битах на байт.</w:t>
             </w:r>
           </w:p>
           <w:p>
@@ -1748,7 +1817,7 @@
               <w:rPr>
                 <w:lang w:val="ru-RU"/>
               </w:rPr>
-              <w:t>Проверочные биты восстанавливаются так же быстро, как информационные.</w:t>
+              <w:t>Подход объясняет законы масштабирования и выбор токенизатора с позиций теории информации.</w:t>
             </w:r>
             <w:proofErr w:type="spellStart"/>
             <w:proofErr w:type="spellEnd"/>
@@ -1805,7 +1874,7 @@
               <w:rPr>
                 <w:lang w:val="ru-RU"/>
               </w:rPr>
-              <w:t>Длина закодированного сообщения растёт экспоненциально.</w:t>
+              <w:t>Модель весит сотни гигабайт, и выигрыш появляется только на терабайтных объёмах данных.</w:t>
             </w:r>
           </w:p>
           <w:p>
@@ -1824,7 +1893,7 @@
               <w:rPr>
                 <w:lang w:val="ru-RU"/>
               </w:rPr>
-              <w:t>По избыточности эти коды сильно проигрывают кодам Рида–Соломона.</w:t>
+              <w:t>Время работы трансформера растёт квадратично с длиной контекста, поэтому сжатие очень медленное.</w:t>
             </w:r>
             <w:proofErr w:type="spellStart"/>
             <w:proofErr w:type="spellEnd"/>
@@ -1845,7 +1914,7 @@
               <w:rPr>
                 <w:lang w:val="ru-RU"/>
               </w:rPr>
-              <w:t>Для кодов с большим числом запросов предел эффективности неизвестен.</w:t>
+              <w:t>Для распаковки нужна та же модель и то же вычислительное оборудование, что и для упаковки.</w:t>
             </w:r>
           </w:p>
         </w:tc>
@@ -1919,7 +1988,7 @@
               <w:rPr>
                 <w:lang w:val="ru-RU"/>
               </w:rPr>
-              <w:t>Код Хэмминга как студент на сессии: одну ошибку исправит, о двух узнает.</w:t>
+              <w:t>Хороший архиватор как хороший студент: всё предсказывает заранее, поэтому на экзамене пишет меньше.</w:t>
             </w:r>
           </w:p>
         </w:tc>

</xml_diff>